<commit_message>
full paper before bibliography
</commit_message>
<xml_diff>
--- a/final_project/final_project_paper.docx
+++ b/final_project/final_project_paper.docx
@@ -7,7 +7,13 @@
         <w:pStyle w:val="1"/>
       </w:pPr>
       <w:r>
-        <w:t>The co-evolution arms race in predator-prey dynamics</w:t>
+        <w:t>The co-evolution</w:t>
+      </w:r>
+      <w:r>
+        <w:t>ary</w:t>
+      </w:r>
+      <w:r>
+        <w:t xml:space="preserve"> arms race in predator-prey dynamics</w:t>
       </w:r>
     </w:p>
     <w:p>
@@ -35,66 +41,89 @@
       </w:r>
     </w:p>
     <w:p>
-      <w:proofErr w:type="spellStart"/>
-      <w:r>
-        <w:t>Lsjfkljs</w:t>
-      </w:r>
-      <w:proofErr w:type="spellEnd"/>
+      <w:r>
+        <w:t xml:space="preserve">The dynamics of </w:t>
+      </w:r>
+      <w:r>
+        <w:t>prey</w:t>
+      </w:r>
+      <w:r>
+        <w:t>-predator interaction</w:t>
+      </w:r>
+      <w:r>
+        <w:t>s</w:t>
+      </w:r>
+      <w:r>
+        <w:t xml:space="preserve"> have been described mathematically by Lotka and Volterra from the ecological aspect, but their model assumes </w:t>
+      </w:r>
+      <w:r>
+        <w:t xml:space="preserve">no mutations and infinite resources. Such dynamic often leads to an evolutionary arms race which is not incorporated by the Lotka-Volterra equation. In this work, we simulate prey-predator dynamics in a Lotka-Volterra setting but with added evolutionary variables such as mutation rate and fitness, both heritable with some variability, and adjust to a realistic scenario by imposing a limit on the resources for the prey. We find that the simulation exhibits Lotka-Volterra-like oscillations for about 400 days before transitioning into a stable steady state, and that the prey and predator fitness and mutation rates increase throughout the simulation. </w:t>
+      </w:r>
+      <w:r>
+        <w:t>This work demonstrates that the inclusion of evolutionary constraints in predator-prey models can lead to the stabilization of population dynamics, moving beyond the perpetual oscillations of the classical Lotka-Volterra equations</w:t>
+      </w:r>
+      <w:r>
+        <w:t xml:space="preserve">. </w:t>
+      </w:r>
     </w:p>
     <w:p>
       <w:pPr>
         <w:pStyle w:val="2"/>
       </w:pPr>
-      <w:commentRangeStart w:id="0"/>
       <w:r>
         <w:t>Introduction</w:t>
       </w:r>
-      <w:commentRangeEnd w:id="0"/>
-      <w:r>
-        <w:rPr>
-          <w:rStyle w:val="ae"/>
-          <w:rFonts w:asciiTheme="minorHAnsi" w:eastAsiaTheme="minorHAnsi" w:hAnsiTheme="minorHAnsi" w:cstheme="minorBidi"/>
-          <w:color w:val="auto"/>
-        </w:rPr>
-        <w:commentReference w:id="0"/>
-      </w:r>
-    </w:p>
-    <w:p>
-      <w:r>
-        <w:t>The relationship between a predator and its prey</w:t>
-      </w:r>
-      <w:r>
-        <w:t xml:space="preserve"> is a main driver of evolution for both populations. The </w:t>
-      </w:r>
-      <w:r>
-        <w:t xml:space="preserve">prey must develop new strategies to avoid the predator (increased speed, camouflage, venomous skin to prevent predation etc.) and the predator must develop new strategies to hunt the prey (increased speed, venom resistance, physical strength that will help it kill the prey etc.). This drives a co-evolutionary arms race between a predator and its prey, which leads to rapid evolution and constant improvement of their fitness values. </w:t>
-      </w:r>
-    </w:p>
-    <w:p>
-      <w:r>
-        <w:rPr>
-          <w:b/>
-          <w:bCs/>
-        </w:rPr>
-        <w:t>The Lotka-Volterra model</w:t>
-      </w:r>
-    </w:p>
-    <w:p>
-      <w:r>
-        <w:t xml:space="preserve">One of the mathematical models describing predator-prey interactions is the Lotka-Volterra model, describing cyclic oscillations in population sizes of prey and predator </w:t>
-      </w:r>
-    </w:p>
-    <w:p>
-      <w:r>
-        <w:t>In this work, we aim to simulate predator-prey dynamics. We aim to repeat known works modelling this interaction (</w:t>
-      </w:r>
-      <w:proofErr w:type="spellStart"/>
-      <w:r>
-        <w:t>lotka-volterra</w:t>
-      </w:r>
-      <w:proofErr w:type="spellEnd"/>
-      <w:r>
-        <w:t xml:space="preserve">), and to provide insights into the influence of this relationship on the fitness of each of the species. </w:t>
+    </w:p>
+    <w:p>
+      <w:r>
+        <w:t xml:space="preserve">The process of evolution of a population is derived by many forces, including the interaction of the population with other populations in the same habitat. One of the most intriguing interactions is predator-prey interactions, a topic that was widely studied from the ecological point of view. </w:t>
+      </w:r>
+    </w:p>
+    <w:p>
+      <w:r>
+        <w:t xml:space="preserve">One of the mathematical models used to describe the dynamics between predator and prey populations is the Lotka-Volterra model. </w:t>
+      </w:r>
+      <w:r>
+        <w:t xml:space="preserve">This model </w:t>
+      </w:r>
+      <w:r>
+        <w:t xml:space="preserve">describes the dynamics between two populations in a defined habitat, where one population is the prey of the other population (the predators). The model suggests that under its assumptions, the size of both populations would rise and fall periodically to achieve oscillations due to an existence of a negative feedback loop: the prey reproduce until being with sufficient numbers to support a larger predator population, followed by rapid growth of the predator population to the point where there are too many predators and the prey population collapses. At that point the number of preys cannot sustain the predator population at its current size and the predator population collapses again, which lifts the burden on the prey population and allows them to rapidly grow again. </w:t>
+      </w:r>
+    </w:p>
+    <w:p>
+      <w:r>
+        <w:t xml:space="preserve">The Lotka-Volterra equations, however useful, create a static view of the population, assuming unlimited resources for the prey population </w:t>
+      </w:r>
+      <w:proofErr w:type="gramStart"/>
+      <w:r>
+        <w:t xml:space="preserve">at all </w:t>
+      </w:r>
+      <w:r>
+        <w:t>times</w:t>
+      </w:r>
+      <w:proofErr w:type="gramEnd"/>
+      <w:r>
+        <w:t xml:space="preserve"> and no changes in the fitness of any of the species.</w:t>
+      </w:r>
+      <w:r>
+        <w:t xml:space="preserve"> These terms are unrealistic, </w:t>
+      </w:r>
+      <w:r>
+        <w:lastRenderedPageBreak/>
+        <w:t xml:space="preserve">as a constant competition between predator and prey populations often drives an evolutionary arms race between the two populations, where prey </w:t>
+      </w:r>
+      <w:proofErr w:type="gramStart"/>
+      <w:r>
+        <w:t>keep</w:t>
+      </w:r>
+      <w:proofErr w:type="gramEnd"/>
+      <w:r>
+        <w:t xml:space="preserve"> evolving to avoid the predators in new ways and the predators evolve to overcome the new mechanisms of the prey. </w:t>
+      </w:r>
+    </w:p>
+    <w:p>
+      <w:r>
+        <w:t xml:space="preserve">Here, we try to model two populations that may behave in a Lotka-Volterra oscillation pattern, while adding some constraints such as resource availability, fitness and mutations into the model, allowing evolutionary processes to take place in the simulation. We hope to use this less-restricting model to investigate the evolutionary implications of a Lotka-Volterra dynamic between prey and predator, revealing a richer and more realistic understanding of these ecological dynamics in the evolutionary context. </w:t>
       </w:r>
     </w:p>
     <w:p>
@@ -107,7 +136,15 @@
     </w:p>
     <w:p>
       <w:r>
-        <w:t xml:space="preserve">Each organism was allowed to reproduce only after 3 days from being born. </w:t>
+        <w:t xml:space="preserve">Our model uses two classes to describe predator and prey populations, each tracking the total number of members in the population, the average fitness of the population and the average mutation rate of the population. Each population is initiated with a specific fitness value, a specific mutation rate and a specific reproduction constant that controls the probability of a specific individual to reproduce. For simplicity, we kept reproduction to be non-sexual. In addition, to simulate a learning period, </w:t>
+      </w:r>
+      <w:proofErr w:type="gramStart"/>
+      <w:r>
+        <w:t>each individual</w:t>
+      </w:r>
+      <w:proofErr w:type="gramEnd"/>
+      <w:r>
+        <w:t xml:space="preserve"> can only replicate if it is at least 3 days old. </w:t>
       </w:r>
     </w:p>
     <w:p>
@@ -122,6 +159,88 @@
     <w:p>
       <w:r>
         <w:t>Our simulation allows random mutations in each reproduction of an organism (either prey or predator) where mutation rate is inherited from the parent but with some added noise, and the result of a mutation is a change in the fitness level of the offspring in comparison to its parent.</w:t>
+      </w:r>
+      <w:r>
+        <w:t xml:space="preserve"> The size of change in fitness is dependent on the mutation rate; with each replication, the offspring inherits the fitness of its parent with added noise of a random sample from a normal distribution with a mean of 0 and a standard deviation the size of the mutation rate. </w:t>
+      </w:r>
+    </w:p>
+    <w:p>
+      <w:r>
+        <w:rPr>
+          <w:b/>
+          <w:bCs/>
+        </w:rPr>
+        <w:t>Resource limitations</w:t>
+      </w:r>
+    </w:p>
+    <w:p>
+      <w:r>
+        <w:t xml:space="preserve">Our model incorporates the existence of grass, which is the food of the prey – so the prey can die also from lack of food and not only due to being killed by a predator. This represents a deviation from the Lotka-Volterra model </w:t>
+      </w:r>
+      <w:r>
+        <w:t>assumptions but</w:t>
+      </w:r>
+      <w:r>
+        <w:t xml:space="preserve"> is a scenario closer to reality. </w:t>
+      </w:r>
+    </w:p>
+    <w:p>
+      <w:r>
+        <w:rPr>
+          <w:b/>
+          <w:bCs/>
+        </w:rPr>
+        <w:t>Predation</w:t>
+      </w:r>
+    </w:p>
+    <w:p>
+      <w:r>
+        <w:t xml:space="preserve">To incorporate the fitness into meaningful impact of the behavior of the model, we determine the probability for successful killing of a prey by a predator by the difference between the fitness values of both organisms. In addition, to create Lotka-Volterra like oscillations </w:t>
+      </w:r>
+      <w:r>
+        <w:t xml:space="preserve">and coordinate with reality we also </w:t>
+      </w:r>
+      <w:proofErr w:type="gramStart"/>
+      <w:r>
+        <w:t xml:space="preserve">take into </w:t>
+      </w:r>
+      <w:r>
+        <w:lastRenderedPageBreak/>
+        <w:t>account</w:t>
+      </w:r>
+      <w:proofErr w:type="gramEnd"/>
+      <w:r>
+        <w:t xml:space="preserve"> the probability </w:t>
+      </w:r>
+      <w:proofErr w:type="gramStart"/>
+      <w:r>
+        <w:t>for</w:t>
+      </w:r>
+      <w:proofErr w:type="gramEnd"/>
+      <w:r>
+        <w:t xml:space="preserve"> an encounter between a predator and a prey, which is dependent on the population size of the prey, the fitness of the predator, and the area of the habitat.</w:t>
+      </w:r>
+    </w:p>
+    <w:p>
+      <w:r>
+        <w:rPr>
+          <w:b/>
+          <w:bCs/>
+        </w:rPr>
+        <w:t>Defining parameters</w:t>
+      </w:r>
+    </w:p>
+    <w:p>
+      <w:r>
+        <w:t xml:space="preserve">Our simulations start with 300 prey individuals, 10 predators and 300 grass units. These numbers can be altered in the code supplied with this </w:t>
+      </w:r>
+      <w:proofErr w:type="gramStart"/>
+      <w:r>
+        <w:t>assay</w:t>
+      </w:r>
+      <w:proofErr w:type="gramEnd"/>
+      <w:r>
+        <w:t xml:space="preserve">. </w:t>
       </w:r>
     </w:p>
     <w:p>
@@ -175,11 +294,19 @@
         <w:t>V</w:t>
       </w:r>
       <w:r>
-        <w:t xml:space="preserve">olterra model describes periodic oscillations between predator and prey populations, where an increase in prey population is followed by an increase in the predator population (due to the increased amount of available prey for the predator), which then causes a crash of the prey population (since all the prey is consumed by the predators) and then a crash of the predator </w:t>
-      </w:r>
-      <w:r>
-        <w:lastRenderedPageBreak/>
-        <w:t xml:space="preserve">population since finding the prey harder then before. This crash in predator population allows the prey population to grow again and restart the cycle, which creates these periodic oscillations. In our simulation, these oscillations can be nicely observed in the first ~400 days of the model, and after that the populations reach a balance in predator and prey numbers to get a </w:t>
+        <w:t xml:space="preserve">olterra model </w:t>
+      </w:r>
+      <w:r>
+        <w:t>prey</w:t>
+      </w:r>
+      <w:r>
+        <w:t>s periodic oscillations between predator and prey populations, where an increase in prey population is followed by an increase in the predator population (due to the increased amount of available prey for the predator), which then causes a crash of the prey population (since all the prey is consumed by the predators) and then a crash of the predator population since finding the prey harder th</w:t>
+      </w:r>
+      <w:r>
+        <w:t>a</w:t>
+      </w:r>
+      <w:r>
+        <w:t xml:space="preserve">n before. This crash in predator population allows the prey population to grow again and restart the cycle, which creates these periodic oscillations. In our simulation, these oscillations can be nicely observed in the first ~400 days of the model, and after that the populations reach a balance in predator and prey numbers to get a </w:t>
       </w:r>
       <w:r>
         <w:t>flatter</w:t>
@@ -189,15 +316,15 @@
       </w:r>
     </w:p>
     <w:p>
-      <w:r>
-        <w:rPr>
-          <w:noProof/>
-        </w:rPr>
+      <w:pPr>
+        <w:jc w:val="center"/>
+      </w:pPr>
+      <w:r>
         <w:drawing>
-          <wp:inline distT="0" distB="0" distL="0" distR="0" wp14:anchorId="37B8C61E" wp14:editId="0A8C1CB0">
+          <wp:inline distT="0" distB="0" distL="0" distR="0" wp14:anchorId="55B4B1ED" wp14:editId="1A15A186">
             <wp:extent cx="5274310" cy="3496945"/>
             <wp:effectExtent l="0" t="0" r="0" b="0"/>
-            <wp:docPr id="810888863" name="תמונה 2"/>
+            <wp:docPr id="1629231402" name="תמונה 2"/>
             <wp:cNvGraphicFramePr>
               <a:graphicFrameLocks xmlns:a="http://schemas.openxmlformats.org/drawingml/2006/main" noChangeAspect="1"/>
             </wp:cNvGraphicFramePr>
@@ -211,7 +338,7 @@
                     </pic:cNvPicPr>
                   </pic:nvPicPr>
                   <pic:blipFill>
-                    <a:blip r:embed="rId9" cstate="print">
+                    <a:blip r:embed="rId5" cstate="print">
                       <a:extLst>
                         <a:ext uri="{28A0092B-C50C-407E-A947-70E740481C1C}">
                           <a14:useLocalDpi xmlns:a14="http://schemas.microsoft.com/office/drawing/2010/main" val="0"/>
@@ -275,6 +402,7 @@
         <w:t xml:space="preserve">The green line represents prey population </w:t>
       </w:r>
       <w:r>
+        <w:lastRenderedPageBreak/>
         <w:t>size,</w:t>
       </w:r>
       <w:r>
@@ -322,11 +450,7 @@
         <w:t>oscillation</w:t>
       </w:r>
       <w:r>
-        <w:t xml:space="preserve"> pattern stops, but notably, </w:t>
-      </w:r>
-      <w:r>
-        <w:lastRenderedPageBreak/>
-        <w:t xml:space="preserve">the prey fitness keeps increasing </w:t>
+        <w:t xml:space="preserve"> pattern stops, but notably, the prey fitness keeps increasing </w:t>
       </w:r>
       <w:r>
         <w:t>at</w:t>
@@ -347,15 +471,15 @@
       </w:r>
     </w:p>
     <w:p>
-      <w:r>
-        <w:rPr>
-          <w:noProof/>
-        </w:rPr>
+      <w:pPr>
+        <w:jc w:val="center"/>
+      </w:pPr>
+      <w:r>
         <w:drawing>
-          <wp:inline distT="0" distB="0" distL="0" distR="0" wp14:anchorId="41CF9493" wp14:editId="23D3AC77">
+          <wp:inline distT="0" distB="0" distL="0" distR="0" wp14:anchorId="2EF66C88" wp14:editId="0EBA3F28">
             <wp:extent cx="5274310" cy="3496945"/>
             <wp:effectExtent l="0" t="0" r="0" b="0"/>
-            <wp:docPr id="459630495" name="תמונה 4"/>
+            <wp:docPr id="1795720335" name="תמונה 4" descr="תמונה שמכילה טקסט, תרשים, קו, צילום מסך&#10;&#10;תוכן בינה מלאכותית גנרטיבית עשוי להיות שגוי."/>
             <wp:cNvGraphicFramePr>
               <a:graphicFrameLocks xmlns:a="http://schemas.openxmlformats.org/drawingml/2006/main" noChangeAspect="1"/>
             </wp:cNvGraphicFramePr>
@@ -363,13 +487,13 @@
               <a:graphicData uri="http://schemas.openxmlformats.org/drawingml/2006/picture">
                 <pic:pic xmlns:pic="http://schemas.openxmlformats.org/drawingml/2006/picture">
                   <pic:nvPicPr>
-                    <pic:cNvPr id="0" name="Picture 13"/>
+                    <pic:cNvPr id="1795720335" name="תמונה 4" descr="תמונה שמכילה טקסט, תרשים, קו, צילום מסך&#10;&#10;תוכן בינה מלאכותית גנרטיבית עשוי להיות שגוי."/>
                     <pic:cNvPicPr>
                       <a:picLocks noChangeAspect="1" noChangeArrowheads="1"/>
                     </pic:cNvPicPr>
                   </pic:nvPicPr>
                   <pic:blipFill>
-                    <a:blip r:embed="rId10" cstate="print">
+                    <a:blip r:embed="rId6" cstate="print">
                       <a:extLst>
                         <a:ext uri="{28A0092B-C50C-407E-A947-70E740481C1C}">
                           <a14:useLocalDpi xmlns:a14="http://schemas.microsoft.com/office/drawing/2010/main" val="0"/>
@@ -434,21 +558,24 @@
         <w:t>Average fitness of the prey population over time.</w:t>
       </w:r>
       <w:r>
-        <w:t xml:space="preserve"> The blue line represents a prey population in a simulation including an initial population of predators, and the orange line represents a prey population where no predators were introduced into the habitat at any point. All prey individuals were initialized with a fitness value of 1.</w:t>
+        <w:t xml:space="preserve"> The blue line represents a prey population in a simulation including an initial population of predators, and the orange line represents a prey population where no </w:t>
+      </w:r>
+      <w:r>
+        <w:lastRenderedPageBreak/>
+        <w:t>predators were introduced into the habitat at any point. All prey individuals were initialized with a fitness value of 1.</w:t>
       </w:r>
     </w:p>
     <w:p/>
     <w:p>
-      <w:r>
-        <w:rPr>
-          <w:noProof/>
-        </w:rPr>
-        <w:lastRenderedPageBreak/>
+      <w:pPr>
+        <w:jc w:val="center"/>
+      </w:pPr>
+      <w:r>
         <w:drawing>
-          <wp:inline distT="0" distB="0" distL="0" distR="0" wp14:anchorId="06AEB41D" wp14:editId="4A6BE872">
+          <wp:inline distT="0" distB="0" distL="0" distR="0" wp14:anchorId="477C5CD0" wp14:editId="49EFC736">
             <wp:extent cx="5274310" cy="3496945"/>
             <wp:effectExtent l="0" t="0" r="0" b="0"/>
-            <wp:docPr id="2117093318" name="תמונה 6"/>
+            <wp:docPr id="1237598051" name="תמונה 6" descr="תמונה שמכילה טקסט, עלילה, תרשים, צילום מסך&#10;&#10;תוכן בינה מלאכותית גנרטיבית עשוי להיות שגוי."/>
             <wp:cNvGraphicFramePr>
               <a:graphicFrameLocks xmlns:a="http://schemas.openxmlformats.org/drawingml/2006/main" noChangeAspect="1"/>
             </wp:cNvGraphicFramePr>
@@ -456,13 +583,13 @@
               <a:graphicData uri="http://schemas.openxmlformats.org/drawingml/2006/picture">
                 <pic:pic xmlns:pic="http://schemas.openxmlformats.org/drawingml/2006/picture">
                   <pic:nvPicPr>
-                    <pic:cNvPr id="0" name="Picture 20"/>
+                    <pic:cNvPr id="1237598051" name="תמונה 6" descr="תמונה שמכילה טקסט, עלילה, תרשים, צילום מסך&#10;&#10;תוכן בינה מלאכותית גנרטיבית עשוי להיות שגוי."/>
                     <pic:cNvPicPr>
                       <a:picLocks noChangeAspect="1" noChangeArrowheads="1"/>
                     </pic:cNvPicPr>
                   </pic:nvPicPr>
                   <pic:blipFill>
-                    <a:blip r:embed="rId11" cstate="print">
+                    <a:blip r:embed="rId7" cstate="print">
                       <a:extLst>
                         <a:ext uri="{28A0092B-C50C-407E-A947-70E740481C1C}">
                           <a14:useLocalDpi xmlns:a14="http://schemas.microsoft.com/office/drawing/2010/main" val="0"/>
@@ -533,25 +660,31 @@
     <w:p>
       <w:r>
         <w:rPr>
-          <w:highlight w:val="yellow"/>
-        </w:rPr>
-        <w:t>Since mutation rate was also variable in our model, it is interesting to look at the mutation rate in both populations over time. We can see somewhat of a pattern in the prey mutation rate, with an increase in mutation rate whenever the prey population size was at a minimum, but a "flatter" pattern when the population is large (figure 4). This pattern is abolished when reaching balance in the population sizes and the mutation rate slowly decreases, turning into random values closer to the starting point. When looking at the predator mutation rate, there is no clear pattern related to the population sizes, and it looks more like a truly random process</w:t>
-      </w:r>
-      <w:r>
-        <w:t xml:space="preserve">. </w:t>
-      </w:r>
-    </w:p>
-    <w:p>
-      <w:r>
-        <w:rPr>
-          <w:noProof/>
-        </w:rPr>
+          <w:b/>
+          <w:bCs/>
+        </w:rPr>
+        <w:t>Mutation rate over time</w:t>
+      </w:r>
+    </w:p>
+    <w:p>
+      <w:r>
+        <w:t>In our model, the rate of fitness change is dependent on the mutation rate: the more mutations gained in each generation, the larger magnitude of possible change (both gain and loss of fitness). When tracking the mutation rate of the prey and predator populations over time, we can see that the general trend in both populations is that the mutation rate increases with time in the model (figure 4). We can see in the prey population that local minima in the average mutation rate are correlated with local minima in the population size (figure 1). However, like when tracking the average fitness of the populations, the predator population does not show this kind of correlation between mutation rate and population size (figure 4).</w:t>
+      </w:r>
+      <w:r>
+        <w:t xml:space="preserve"> </w:t>
+      </w:r>
+    </w:p>
+    <w:p>
+      <w:pPr>
+        <w:jc w:val="center"/>
+      </w:pPr>
+      <w:r>
         <w:lastRenderedPageBreak/>
         <w:drawing>
-          <wp:inline distT="0" distB="0" distL="0" distR="0" wp14:anchorId="3E70902C" wp14:editId="45939946">
+          <wp:inline distT="0" distB="0" distL="0" distR="0" wp14:anchorId="04D7C241" wp14:editId="7B2EB557">
             <wp:extent cx="5274310" cy="3496945"/>
             <wp:effectExtent l="0" t="0" r="0" b="0"/>
-            <wp:docPr id="8335444" name="תמונה 8"/>
+            <wp:docPr id="1793010504" name="תמונה 8" descr="תמונה שמכילה טקסט, צילום מסך, עלילה, תרשים&#10;&#10;תוכן בינה מלאכותית גנרטיבית עשוי להיות שגוי."/>
             <wp:cNvGraphicFramePr>
               <a:graphicFrameLocks xmlns:a="http://schemas.openxmlformats.org/drawingml/2006/main" noChangeAspect="1"/>
             </wp:cNvGraphicFramePr>
@@ -559,13 +692,13 @@
               <a:graphicData uri="http://schemas.openxmlformats.org/drawingml/2006/picture">
                 <pic:pic xmlns:pic="http://schemas.openxmlformats.org/drawingml/2006/picture">
                   <pic:nvPicPr>
-                    <pic:cNvPr id="0" name="Picture 27"/>
+                    <pic:cNvPr id="1793010504" name="תמונה 8" descr="תמונה שמכילה טקסט, צילום מסך, עלילה, תרשים&#10;&#10;תוכן בינה מלאכותית גנרטיבית עשוי להיות שגוי."/>
                     <pic:cNvPicPr>
                       <a:picLocks noChangeAspect="1" noChangeArrowheads="1"/>
                     </pic:cNvPicPr>
                   </pic:nvPicPr>
                   <pic:blipFill>
-                    <a:blip r:embed="rId12" cstate="print">
+                    <a:blip r:embed="rId8" cstate="print">
                       <a:extLst>
                         <a:ext uri="{28A0092B-C50C-407E-A947-70E740481C1C}">
                           <a14:useLocalDpi xmlns:a14="http://schemas.microsoft.com/office/drawing/2010/main" val="0"/>
@@ -603,45 +736,88 @@
       </w:pPr>
       <w:r>
         <w:rPr>
-          <w:highlight w:val="yellow"/>
+          <w:b/>
+          <w:bCs/>
         </w:rPr>
         <w:t>Fig</w:t>
       </w:r>
       <w:r>
         <w:rPr>
-          <w:highlight w:val="yellow"/>
+          <w:b/>
+          <w:bCs/>
         </w:rPr>
         <w:t>ure</w:t>
       </w:r>
       <w:r>
         <w:rPr>
-          <w:highlight w:val="yellow"/>
-        </w:rPr>
-        <w:t xml:space="preserve"> 4. </w:t>
-      </w:r>
-      <w:r>
-        <w:rPr>
-          <w:highlight w:val="yellow"/>
+          <w:b/>
+          <w:bCs/>
+        </w:rPr>
+        <w:t xml:space="preserve"> 4.</w:t>
+      </w:r>
+      <w:r>
+        <w:t xml:space="preserve"> </w:t>
+      </w:r>
+      <w:r>
+        <w:rPr>
+          <w:b/>
+          <w:bCs/>
         </w:rPr>
         <w:t>Average m</w:t>
       </w:r>
       <w:r>
         <w:rPr>
-          <w:highlight w:val="yellow"/>
-        </w:rPr>
-        <w:t>utation rate of predator and prey over time</w:t>
-      </w:r>
-      <w:r>
-        <w:rPr>
-          <w:highlight w:val="yellow"/>
-        </w:rPr>
-        <w:t xml:space="preserve">. All individuals in the model </w:t>
-      </w:r>
-      <w:r>
-        <w:rPr>
-          <w:highlight w:val="yellow"/>
-        </w:rPr>
-        <w:t xml:space="preserve"> (what is this graph telling us? No particular relationship between predator and prey. Should we plot here mutation rate and population size on same plot? Maybe this will tell us something)</w:t>
+          <w:b/>
+          <w:bCs/>
+        </w:rPr>
+        <w:t>utation rate of predator and prey</w:t>
+      </w:r>
+      <w:r>
+        <w:rPr>
+          <w:b/>
+          <w:bCs/>
+        </w:rPr>
+        <w:t xml:space="preserve"> </w:t>
+      </w:r>
+      <w:proofErr w:type="spellStart"/>
+      <w:r>
+        <w:rPr>
+          <w:b/>
+          <w:bCs/>
+        </w:rPr>
+        <w:t>populatiosn</w:t>
+      </w:r>
+      <w:proofErr w:type="spellEnd"/>
+      <w:r>
+        <w:rPr>
+          <w:b/>
+          <w:bCs/>
+        </w:rPr>
+        <w:t xml:space="preserve"> over time</w:t>
+      </w:r>
+      <w:r>
+        <w:rPr>
+          <w:b/>
+          <w:bCs/>
+        </w:rPr>
+        <w:t>.</w:t>
+      </w:r>
+      <w:r>
+        <w:t xml:space="preserve"> All individuals in the model</w:t>
+      </w:r>
+      <w:r>
+        <w:t xml:space="preserve"> </w:t>
+      </w:r>
+      <w:r>
+        <w:t xml:space="preserve">were initiated with a mutation rate of 0.1 at the beginning of the model. The blue line represents the average mutation rate of the prey population, and the red line represents the average </w:t>
+      </w:r>
+      <w:proofErr w:type="spellStart"/>
+      <w:r>
+        <w:t>mutatioj</w:t>
+      </w:r>
+      <w:proofErr w:type="spellEnd"/>
+      <w:r>
+        <w:t xml:space="preserve"> rate of the predator population. </w:t>
       </w:r>
     </w:p>
     <w:p>
@@ -698,32 +874,47 @@
     </w:p>
     <w:p>
       <w:r>
-        <w:t xml:space="preserve">In such context, it is interesting to examine the effect of introducing a new immigrant population of predators into the habitat. The immigrant predators may not be well adjusted to the arms race between the local predator and prey populations, but the general fitness to abiotic pressures would be higher in the new immigrants since they are not a part of the same inbreeding group. Therefore, we examined the behavior of both populations when after 1000 days of running the standard model, 50 new predators are introduced into the world, with a higher fitness than the existing predator population (their fitness was set to be double the average predator fitness at the point of immigration). </w:t>
-      </w:r>
-      <w:r>
-        <w:t xml:space="preserve">As can be seen in figure 5, the predators were introduced when the habitat </w:t>
-      </w:r>
-      <w:r>
-        <w:t>had already</w:t>
+        <w:t xml:space="preserve">In such context, it is interesting to examine the effect of introducing a new immigrant population of predators into the habitat. The immigrant predators may not be well adjusted to the arms race between the local predator and prey populations, but the general fitness to abiotic pressures would be higher in the new immigrants since they are not a part of the same inbreeding group. Therefore, we examined the behavior of both populations when after 1000 days of running the standard model, </w:t>
+      </w:r>
+      <w:r>
+        <w:t>10</w:t>
+      </w:r>
+      <w:r>
+        <w:t xml:space="preserve">0 new predators are introduced into the world, with a higher fitness than the existing predator population (their fitness was set to </w:t>
+      </w:r>
+      <w:r>
+        <w:t>be</w:t>
+      </w:r>
+      <w:r>
+        <w:t xml:space="preserve"> the average predator fitness at the point of immigration</w:t>
+      </w:r>
+      <w:r>
+        <w:t xml:space="preserve"> plus 1</w:t>
+      </w:r>
+      <w:r>
+        <w:t xml:space="preserve">). As can be </w:t>
+      </w:r>
+      <w:r>
+        <w:lastRenderedPageBreak/>
+        <w:t xml:space="preserve">seen in figure 5, the predators were introduced when the habitat had already reached a balance. Addition of the new predators caused </w:t>
+      </w:r>
+      <w:r>
+        <w:t>a drop in the number of prey individuals along with the increase in predator number, but not for long; the system quickly returned to balance and the prey and predator numbers returned to the original numbers from before the introduction of immigrants.</w:t>
       </w:r>
       <w:r>
         <w:t xml:space="preserve"> </w:t>
       </w:r>
-      <w:r>
-        <w:lastRenderedPageBreak/>
-        <w:t xml:space="preserve">reached a balance. Addition of the new predators </w:t>
-      </w:r>
-      <w:r>
-        <w:t xml:space="preserve">caused an immediate collapse of the prey population to zero, followed by a relatively fast decrease of the predator population to zero as well. </w:t>
-      </w:r>
-    </w:p>
-    <w:p>
+    </w:p>
+    <w:p>
+      <w:pPr>
+        <w:jc w:val="center"/>
+      </w:pPr>
       <w:r>
         <w:drawing>
-          <wp:inline distT="0" distB="0" distL="0" distR="0" wp14:anchorId="190FFCE2" wp14:editId="0A0C279E">
+          <wp:inline distT="0" distB="0" distL="0" distR="0" wp14:anchorId="0A8A99D1" wp14:editId="1B4D61E5">
             <wp:extent cx="5274310" cy="3498215"/>
             <wp:effectExtent l="0" t="0" r="0" b="0"/>
-            <wp:docPr id="844798741" name="תמונה 2"/>
+            <wp:docPr id="1539567170" name="תמונה 10"/>
             <wp:cNvGraphicFramePr>
               <a:graphicFrameLocks xmlns:a="http://schemas.openxmlformats.org/drawingml/2006/main" noChangeAspect="1"/>
             </wp:cNvGraphicFramePr>
@@ -731,13 +922,13 @@
               <a:graphicData uri="http://schemas.openxmlformats.org/drawingml/2006/picture">
                 <pic:pic xmlns:pic="http://schemas.openxmlformats.org/drawingml/2006/picture">
                   <pic:nvPicPr>
-                    <pic:cNvPr id="0" name="Picture 6"/>
+                    <pic:cNvPr id="0" name="Picture 34"/>
                     <pic:cNvPicPr>
                       <a:picLocks noChangeAspect="1" noChangeArrowheads="1"/>
                     </pic:cNvPicPr>
                   </pic:nvPicPr>
                   <pic:blipFill>
-                    <a:blip r:embed="rId13" cstate="print">
+                    <a:blip r:embed="rId9" cstate="print">
                       <a:extLst>
                         <a:ext uri="{28A0092B-C50C-407E-A947-70E740481C1C}">
                           <a14:useLocalDpi xmlns:a14="http://schemas.microsoft.com/office/drawing/2010/main" val="0"/>
@@ -774,7 +965,38 @@
         <w:pStyle w:val="figurelegend"/>
       </w:pPr>
       <w:r>
-        <w:t xml:space="preserve">Fig 5. Effect of predator immigrants with improved fitness on the prey and predator population dynamics. An initial model with </w:t>
+        <w:rPr>
+          <w:b/>
+          <w:bCs/>
+        </w:rPr>
+        <w:t>Fig</w:t>
+      </w:r>
+      <w:r>
+        <w:rPr>
+          <w:b/>
+          <w:bCs/>
+        </w:rPr>
+        <w:t>ure</w:t>
+      </w:r>
+      <w:r>
+        <w:rPr>
+          <w:b/>
+          <w:bCs/>
+        </w:rPr>
+        <w:t xml:space="preserve"> 5.</w:t>
+      </w:r>
+      <w:r>
+        <w:t xml:space="preserve"> </w:t>
+      </w:r>
+      <w:r>
+        <w:rPr>
+          <w:b/>
+          <w:bCs/>
+        </w:rPr>
+        <w:t>Effect of predator immigrants with improved fitness on the prey and predator population dynamics.</w:t>
+      </w:r>
+      <w:r>
+        <w:t xml:space="preserve"> An initial model with </w:t>
       </w:r>
       <w:r>
         <w:t>10</w:t>
@@ -786,7 +1008,25 @@
         <w:t>300</w:t>
       </w:r>
       <w:r>
-        <w:t xml:space="preserve"> prey organisms was run for 1000 days. On day 1000, 50 new predators with a fitness value that is double the average predator fitness at that point were introduced into the world. The black dotted line marks the point in time where the new predators were introduced into the world. </w:t>
+        <w:t xml:space="preserve"> prey organisms was run for 1000 days. On day 1000, </w:t>
+      </w:r>
+      <w:r>
+        <w:t>10</w:t>
+      </w:r>
+      <w:r>
+        <w:t xml:space="preserve">0 new predators with a fitness value that is </w:t>
+      </w:r>
+      <w:r>
+        <w:t>larger than</w:t>
+      </w:r>
+      <w:r>
+        <w:t xml:space="preserve"> the average predator fitness at that point</w:t>
+      </w:r>
+      <w:r>
+        <w:t xml:space="preserve"> by 1</w:t>
+      </w:r>
+      <w:r>
+        <w:t xml:space="preserve"> were introduced into the world. The black dotted line marks the point in time where the new predators were introduced into the world. </w:t>
       </w:r>
     </w:p>
     <w:p>
@@ -800,46 +1040,75 @@
     <w:p>
       <w:pPr>
         <w:rPr>
-          <w:rFonts w:hint="cs"/>
           <w:rtl/>
         </w:rPr>
       </w:pPr>
       <w:r>
-        <w:t xml:space="preserve">The aim of this model was to examine the evolutionary implications of prey-predator dynamics. We chose to simulate populations that can show dynamics like the Lotka-Volterra mathematical model, because this is a widely used and discussed model describing the ecological dynamic between the two populations. However, we did not limit our populations to mimic the exact mathematical equations by Lotka and Volterra because that would be </w:t>
-      </w:r>
-    </w:p>
-    <w:p>
-      <w:r>
-        <w:t xml:space="preserve">Figure 1 – why do we reach flat population sizes? Are there evolutionary patterns supporting that? Possibly discuss real world examples of populations in a </w:t>
-      </w:r>
-      <w:proofErr w:type="spellStart"/>
-      <w:r>
-        <w:t>lotka</w:t>
-      </w:r>
-      <w:proofErr w:type="spellEnd"/>
-      <w:r>
-        <w:t xml:space="preserve"> Volterra dynamic.</w:t>
-      </w:r>
-    </w:p>
-    <w:p>
-      <w:r>
-        <w:t xml:space="preserve">Figure 2 – only improvement is in the presence of a selective constraint imposed by the predator. Discuss low population sizes as a point of founder effect events, in addition to predators eating the weaker parts of the population giving rise to an essentially fitter founder population. </w:t>
-      </w:r>
-    </w:p>
-    <w:p>
+        <w:t xml:space="preserve">The aim of this model was to examine the evolutionary implications of prey-predator dynamics. We chose to simulate populations that can show dynamics like the Lotka-Volterra mathematical model, because this is a widely used and discussed model describing the ecological dynamic between the two populations. However, we did not limit our populations to mimic the exact mathematical equations by Lotka and </w:t>
+      </w:r>
+      <w:r>
+        <w:t xml:space="preserve">Volterra but rather set an initial model that can create terms for oscillations and test whether these oscillations continue throughout the simulation or are abolished at some point. As can be seen in figure 1, we have reached a Lotka-Volterra behavior for ~400 days and then the system balanced itself into more stable numbers. </w:t>
+      </w:r>
+      <w:r>
+        <w:t xml:space="preserve">This balancing is probably due to our model allowing mutations of the population, creating an arms race that ultimately brings the selective pressures acting on both populations to find a balance – the prey population is large enough to sustain the predators, and the </w:t>
+      </w:r>
       <w:r>
         <w:lastRenderedPageBreak/>
-        <w:t xml:space="preserve">Figure 3 – we don’t see effect of population size on fitness because the chance to meet a prey is not dependent on predator fitness (only the chance to overcome the prey  if found), so the constraint is not selective and more arbitrary. </w:t>
-      </w:r>
-    </w:p>
-    <w:p>
-      <w:r>
-        <w:t xml:space="preserve">Figure 4 – what can we say about mutation rates? </w:t>
-      </w:r>
-    </w:p>
-    <w:p>
-      <w:r>
-        <w:t xml:space="preserve">Figure 5 – discuss inbreeding depression, rescue effect, the fact that it usually does not help, etc. discuss low points of our model (fitness is not defined well enough). </w:t>
+        <w:t xml:space="preserve">efficiency of prey hunting balances the ability of the prey </w:t>
+      </w:r>
+      <w:r>
+        <w:t>to avoid predation so that the number of individuals getting eaten by the predators remains relatively equal. The presence of a sustained predator population is important to limit the size of the prey population, stopping them from reproducing to the point where they deplete all resources (grass).</w:t>
+      </w:r>
+      <w:r>
+        <w:t xml:space="preserve"> </w:t>
+      </w:r>
+    </w:p>
+    <w:p>
+      <w:r>
+        <w:t>The selective pressure resulting from the predator-prey dynamic causes the relative fitness of both populations to increase over time (figure 2, 3). However, there is a pattern that differs between the two populations – the fitness of the prey population undergoes faster increase when the prey population is decreasing, but the rate of elevation of the predator fitness remains rather constant throughout the simulation time frame. This can be explained when looking at the different pressures acting on both populations. When the prey population is at a minimum, its members create a "founder community". The rapid population growth that follows creates a diversification of fitness in the population around the initial fitness values of the founders, creating a rather "flat" fitness curve. When reaching a local maximum of population size, the population starts decreasing – mostly because of predators eating the prey. The predators tend to eat the least fit prey individuals, creating a scenario where each predation event elevates the average fitness of the prey population, creating a rapid increase in the fitness curve. when looking at the predator population, their death is always linked to not eating prey, which can happen for two reasons: either the prey is not found (</w:t>
+      </w:r>
+      <w:r>
+        <w:t xml:space="preserve">random pressure) or it is too strong to overcome (selective pressure). The rapid death of predators is caused by the lack of available prey leading to less prey encounters, a pressure that is activated randomly on the entire predator population, with no effect for fitness, therefore killing predators from all fitness levels of the population – so we do not see the same rapid elevation of fitness that we see in the prey population. </w:t>
+      </w:r>
+    </w:p>
+    <w:p>
+      <w:r>
+        <w:t xml:space="preserve">In the analysis of average mutation rate in the populations, we see a similar trend of overall increase in mutation rate over the time frame of the simulation (figure 4). This may result from the need for fast improvements in fitness in the ongoing arms race between the species; higher mutation rate, although harboring a danger of faster decrease in fitness, also allows a rapid increase in fitness which can lead to greater advantages for a population in a shorter time. We can see a trend in the prey population of local minima in average mutation rates that correspond to local minima of the population size, which could be explained by the need to retain the high fitness that the population achieved – with high numbers of predators around, any loss of fitness would result in death and therefore less changes are preferred. However, lower predator numbers are prone to miss </w:t>
+      </w:r>
+      <w:r>
+        <w:t>prey</w:t>
+      </w:r>
+      <w:r>
+        <w:t xml:space="preserve"> due to the size of the habitat, therefore allowing larger changes in fitness in the hopes of achieving an advantage with less grave results for a fitness decrease. </w:t>
+      </w:r>
+      <w:r>
+        <w:t xml:space="preserve">Again, we don’t see here this trend in the predator </w:t>
+      </w:r>
+      <w:r>
+        <w:t xml:space="preserve">population, for reasons that are </w:t>
+      </w:r>
+      <w:r>
+        <w:t>like</w:t>
+      </w:r>
+      <w:r>
+        <w:t xml:space="preserve"> those described above when discussing trends in the average fitness. </w:t>
+      </w:r>
+    </w:p>
+    <w:p>
+      <w:r>
+        <w:lastRenderedPageBreak/>
+        <w:t xml:space="preserve">When analyzing the effect of the higher-fitness immigrants (figure 5), we can see that after the short elevation in number of predators and decrease in number of prey individuals, the system quickly returns to its already-determined balance point from before the immigration timepoint. This can point towards the balance point of prey and predators being close to the maximum bearing capacity of the habitat: the prey population is as high as the available resources (grass) can sustain in constant numbers, and the predator population is as high as its available resources (prey) can sustain in constant numbers. In addition, since the mutation rate at that point is generally high (figure 4), the prey population quickly evolves to balance the new average fitness of the predators, allowing the balance to resume. </w:t>
+      </w:r>
+    </w:p>
+    <w:p>
+      <w:r>
+        <w:t xml:space="preserve">We added the new predators with a higher fitness because of the general tendency of small populations to spiral into </w:t>
+      </w:r>
+      <w:r>
+        <w:t>inbreeding depression. That is what happens when a high rate of inbreeding (resulting from the small population size) creates random fixation of harmful traits, with no addition of new traits in</w:t>
+      </w:r>
+      <w:r>
+        <w:t xml:space="preserve">to the gene pool. This creates a growing genetic burden on these inbreeding populations, leaving them less fit than other organisms from the same species. This process can ultimately drive the inbreeding population to extinction (extinction vortex). When adding new immigrants into the population, we add new traits into the gene pool and supposedly allow recovery of the population's fitness; the reality is that the immigrant has the highest number of offsprings due to its higher fitness, resulting in its genes becoming most dominant in the population to the point where the inbreeding depression process quickly restarts. This can also be a possible explanation for why the balance between prey and predator population sizes was quickly restored. A more sophisticated design of the model which defines fitness on different levels (fitness to prey-predator dynamics, fitness to abiotic pressures etc.) may allow further investigation of this interplay between the elevated fitness in context of the prey-predator arms race, and the inbreeding depression that must occur in small populations that confer the Lotka-Volterra behavior. </w:t>
       </w:r>
     </w:p>
     <w:p>
@@ -865,61 +1134,6 @@
     </w:sectPr>
   </w:body>
 </w:document>
-</file>
-
-<file path=word/comments.xml><?xml version="1.0" encoding="utf-8"?>
-<w:comments xmlns:wpc="http://schemas.microsoft.com/office/word/2010/wordprocessingCanvas" xmlns:cx="http://schemas.microsoft.com/office/drawing/2014/chartex" xmlns:cx1="http://schemas.microsoft.com/office/drawing/2015/9/8/chartex" xmlns:cx2="http://schemas.microsoft.com/office/drawing/2015/10/21/chartex" xmlns:cx3="http://schemas.microsoft.com/office/drawing/2016/5/9/chartex" xmlns:cx4="http://schemas.microsoft.com/office/drawing/2016/5/10/chartex" xmlns:cx5="http://schemas.microsoft.com/office/drawing/2016/5/11/chartex" xmlns:cx6="http://schemas.microsoft.com/office/drawing/2016/5/12/chartex" xmlns:cx7="http://schemas.microsoft.com/office/drawing/2016/5/13/chartex" xmlns:cx8="http://schemas.microsoft.com/office/drawing/2016/5/14/chartex" xmlns:mc="http://schemas.openxmlformats.org/markup-compatibility/2006" xmlns:aink="http://schemas.microsoft.com/office/drawing/2016/ink" xmlns:am3d="http://schemas.microsoft.com/office/drawing/2017/model3d" xmlns:o="urn:schemas-microsoft-com:office:office" xmlns:oel="http://schemas.microsoft.com/office/2019/extlst" xmlns:r="http://schemas.openxmlformats.org/officeDocument/2006/relationships" xmlns:m="http://schemas.openxmlformats.org/officeDocument/2006/math" xmlns:v="urn:schemas-microsoft-com:vml" xmlns:wp14="http://schemas.microsoft.com/office/word/2010/wordprocessingDrawing" xmlns:wp="http://schemas.openxmlformats.org/drawingml/2006/wordprocessingDrawing" xmlns:w10="urn:schemas-microsoft-com:office:word" xmlns:w="http://schemas.openxmlformats.org/wordprocessingml/2006/main" xmlns:w14="http://schemas.microsoft.com/office/word/2010/wordml" xmlns:w15="http://schemas.microsoft.com/office/word/2012/wordml" xmlns:w16cex="http://schemas.microsoft.com/office/word/2018/wordml/cex" xmlns:w16cid="http://schemas.microsoft.com/office/word/2016/wordml/cid" xmlns:w16="http://schemas.microsoft.com/office/word/2018/wordml" xmlns:w16du="http://schemas.microsoft.com/office/word/2023/wordml/word16du" xmlns:w16sdtdh="http://schemas.microsoft.com/office/word/2020/wordml/sdtdatahash" xmlns:w16sdtfl="http://schemas.microsoft.com/office/word/2024/wordml/sdtformatlock" xmlns:w16se="http://schemas.microsoft.com/office/word/2015/wordml/symex" xmlns:wpg="http://schemas.microsoft.com/office/word/2010/wordprocessingGroup" xmlns:wpi="http://schemas.microsoft.com/office/word/2010/wordprocessingInk" xmlns:wne="http://schemas.microsoft.com/office/word/2006/wordml" xmlns:wps="http://schemas.microsoft.com/office/word/2010/wordprocessingShape" mc:Ignorable="w14 w15 w16se w16cid w16 w16cex w16sdtdh w16sdtfl w16du wp14">
-  <w:comment w:id="0" w:author="Sarit Moses" w:date="2025-08-11T21:27:00Z" w:initials="SM">
-    <w:p>
-      <w:pPr>
-        <w:pStyle w:val="af"/>
-      </w:pPr>
-      <w:r>
-        <w:rPr>
-          <w:rStyle w:val="ae"/>
-        </w:rPr>
-        <w:annotationRef/>
-      </w:r>
-      <w:r>
-        <w:t>Ecological systems are defined by a complex web of interactions, none more fundamental than the relationship between a predator and its prey. This dynamic, a perpetual struggle for survival, has been a cornerstone of ecological study for centuries. The Lotka-Volterra model, a foundational mathematical framework, provides a simplified yet powerful lens through which to view these oscillations. By describing the cyclical rise and fall of predator and prey populations, the model elegantly captures the basic feedback loop of consumption and reproduction. However, the classical Lotka-Volterra equations, with their fixed parameters, present a static view of this relationship, failing to account for the continuous process of adaptation and co-evolution.</w:t>
-      </w:r>
-    </w:p>
-    <w:p>
-      <w:pPr>
-        <w:pStyle w:val="af"/>
-      </w:pPr>
-      <w:r>
-        <w:t>To move beyond this static representation and explore the more intricate reality of natural selection, this paper simulates an extended Lotka-Volterra model. This simulation integrates two critical evolutionary mechanisms: fitness calculations and a variable mutation rate. The fitness of each individual, predator or prey, is determined by its ability to survive and reproduce within the model's environment, while mutations introduce random changes to key traits. By tracking how these traits change over generations, the simulation allows for the observation of a dynamic and continuous evolutionary arms race. This essay will demonstrate how the addition of these evolutionary pressures transforms the classic Lotka-Volterra cycle into a co-evolving system, where each population's adaptation drives the other's, ultimately revealing a richer and more realistic understanding of ecological dynamics.</w:t>
-      </w:r>
-    </w:p>
-  </w:comment>
-</w:comments>
-</file>
-
-<file path=word/commentsExtended.xml><?xml version="1.0" encoding="utf-8"?>
-<w15:commentsEx xmlns:wpc="http://schemas.microsoft.com/office/word/2010/wordprocessingCanvas" xmlns:cx="http://schemas.microsoft.com/office/drawing/2014/chartex" xmlns:cx1="http://schemas.microsoft.com/office/drawing/2015/9/8/chartex" xmlns:cx2="http://schemas.microsoft.com/office/drawing/2015/10/21/chartex" xmlns:cx3="http://schemas.microsoft.com/office/drawing/2016/5/9/chartex" xmlns:cx4="http://schemas.microsoft.com/office/drawing/2016/5/10/chartex" xmlns:cx5="http://schemas.microsoft.com/office/drawing/2016/5/11/chartex" xmlns:cx6="http://schemas.microsoft.com/office/drawing/2016/5/12/chartex" xmlns:cx7="http://schemas.microsoft.com/office/drawing/2016/5/13/chartex" xmlns:cx8="http://schemas.microsoft.com/office/drawing/2016/5/14/chartex" xmlns:mc="http://schemas.openxmlformats.org/markup-compatibility/2006" xmlns:aink="http://schemas.microsoft.com/office/drawing/2016/ink" xmlns:am3d="http://schemas.microsoft.com/office/drawing/2017/model3d" xmlns:o="urn:schemas-microsoft-com:office:office" xmlns:oel="http://schemas.microsoft.com/office/2019/extlst" xmlns:r="http://schemas.openxmlformats.org/officeDocument/2006/relationships" xmlns:m="http://schemas.openxmlformats.org/officeDocument/2006/math" xmlns:v="urn:schemas-microsoft-com:vml" xmlns:wp14="http://schemas.microsoft.com/office/word/2010/wordprocessingDrawing" xmlns:wp="http://schemas.openxmlformats.org/drawingml/2006/wordprocessingDrawing" xmlns:w10="urn:schemas-microsoft-com:office:word" xmlns:w="http://schemas.openxmlformats.org/wordprocessingml/2006/main" xmlns:w14="http://schemas.microsoft.com/office/word/2010/wordml" xmlns:w15="http://schemas.microsoft.com/office/word/2012/wordml" xmlns:w16cex="http://schemas.microsoft.com/office/word/2018/wordml/cex" xmlns:w16cid="http://schemas.microsoft.com/office/word/2016/wordml/cid" xmlns:w16="http://schemas.microsoft.com/office/word/2018/wordml" xmlns:w16du="http://schemas.microsoft.com/office/word/2023/wordml/word16du" xmlns:w16sdtdh="http://schemas.microsoft.com/office/word/2020/wordml/sdtdatahash" xmlns:w16sdtfl="http://schemas.microsoft.com/office/word/2024/wordml/sdtformatlock" xmlns:w16se="http://schemas.microsoft.com/office/word/2015/wordml/symex" xmlns:wpg="http://schemas.microsoft.com/office/word/2010/wordprocessingGroup" xmlns:wpi="http://schemas.microsoft.com/office/word/2010/wordprocessingInk" xmlns:wne="http://schemas.microsoft.com/office/word/2006/wordml" xmlns:wps="http://schemas.microsoft.com/office/word/2010/wordprocessingShape" mc:Ignorable="w14 w15 w16se w16cid w16 w16cex w16sdtdh w16sdtfl w16du wp14">
-  <w15:commentEx w15:paraId="5307BC18" w15:done="0"/>
-</w15:commentsEx>
-</file>
-
-<file path=word/commentsExtensible.xml><?xml version="1.0" encoding="utf-8"?>
-<w16cex:commentsExtensible xmlns:wpc="http://schemas.microsoft.com/office/word/2010/wordprocessingCanvas" xmlns:cx="http://schemas.microsoft.com/office/drawing/2014/chartex" xmlns:cx1="http://schemas.microsoft.com/office/drawing/2015/9/8/chartex" xmlns:cx2="http://schemas.microsoft.com/office/drawing/2015/10/21/chartex" xmlns:cx3="http://schemas.microsoft.com/office/drawing/2016/5/9/chartex" xmlns:cx4="http://schemas.microsoft.com/office/drawing/2016/5/10/chartex" xmlns:cx5="http://schemas.microsoft.com/office/drawing/2016/5/11/chartex" xmlns:cx6="http://schemas.microsoft.com/office/drawing/2016/5/12/chartex" xmlns:cx7="http://schemas.microsoft.com/office/drawing/2016/5/13/chartex" xmlns:cx8="http://schemas.microsoft.com/office/drawing/2016/5/14/chartex" xmlns:cr="http://schemas.microsoft.com/office/comments/2020/reactions" xmlns:mc="http://schemas.openxmlformats.org/markup-compatibility/2006" xmlns:aink="http://schemas.microsoft.com/office/drawing/2016/ink" xmlns:am3d="http://schemas.microsoft.com/office/drawing/2017/model3d" xmlns:o="urn:schemas-microsoft-com:office:office" xmlns:oel="http://schemas.microsoft.com/office/2019/extlst" xmlns:r="http://schemas.openxmlformats.org/officeDocument/2006/relationships" xmlns:m="http://schemas.openxmlformats.org/officeDocument/2006/math" xmlns:v="urn:schemas-microsoft-com:vml" xmlns:wp14="http://schemas.microsoft.com/office/word/2010/wordprocessingDrawing" xmlns:wp="http://schemas.openxmlformats.org/drawingml/2006/wordprocessingDrawing" xmlns:w10="urn:schemas-microsoft-com:office:word" xmlns:w="http://schemas.openxmlformats.org/wordprocessingml/2006/main" xmlns:w14="http://schemas.microsoft.com/office/word/2010/wordml" xmlns:w15="http://schemas.microsoft.com/office/word/2012/wordml" xmlns:w16cex="http://schemas.microsoft.com/office/word/2018/wordml/cex" xmlns:w16cid="http://schemas.microsoft.com/office/word/2016/wordml/cid" xmlns:w16="http://schemas.microsoft.com/office/word/2018/wordml" xmlns:w16du="http://schemas.microsoft.com/office/word/2023/wordml/word16du" xmlns:w16sdtdh="http://schemas.microsoft.com/office/word/2020/wordml/sdtdatahash" xmlns:w16sdtfl="http://schemas.microsoft.com/office/word/2024/wordml/sdtformatlock" xmlns:w16se="http://schemas.microsoft.com/office/word/2015/wordml/symex" xmlns:wpg="http://schemas.microsoft.com/office/word/2010/wordprocessingGroup" xmlns:wpi="http://schemas.microsoft.com/office/word/2010/wordprocessingInk" xmlns:wne="http://schemas.microsoft.com/office/word/2006/wordml" xmlns:wps="http://schemas.microsoft.com/office/word/2010/wordprocessingShape" mc:Ignorable="w14 w15 w16se w16cid w16 w16cex w16sdtdh w16sdtfl cr w16du wp14">
-  <w16cex:commentExtensible w16cex:durableId="18710610" w16cex:dateUtc="2025-08-11T18:27:00Z"/>
-</w16cex:commentsExtensible>
-</file>
-
-<file path=word/commentsIds.xml><?xml version="1.0" encoding="utf-8"?>
-<w16cid:commentsIds xmlns:wpc="http://schemas.microsoft.com/office/word/2010/wordprocessingCanvas" xmlns:cx="http://schemas.microsoft.com/office/drawing/2014/chartex" xmlns:cx1="http://schemas.microsoft.com/office/drawing/2015/9/8/chartex" xmlns:cx2="http://schemas.microsoft.com/office/drawing/2015/10/21/chartex" xmlns:cx3="http://schemas.microsoft.com/office/drawing/2016/5/9/chartex" xmlns:cx4="http://schemas.microsoft.com/office/drawing/2016/5/10/chartex" xmlns:cx5="http://schemas.microsoft.com/office/drawing/2016/5/11/chartex" xmlns:cx6="http://schemas.microsoft.com/office/drawing/2016/5/12/chartex" xmlns:cx7="http://schemas.microsoft.com/office/drawing/2016/5/13/chartex" xmlns:cx8="http://schemas.microsoft.com/office/drawing/2016/5/14/chartex" xmlns:mc="http://schemas.openxmlformats.org/markup-compatibility/2006" xmlns:aink="http://schemas.microsoft.com/office/drawing/2016/ink" xmlns:am3d="http://schemas.microsoft.com/office/drawing/2017/model3d" xmlns:o="urn:schemas-microsoft-com:office:office" xmlns:oel="http://schemas.microsoft.com/office/2019/extlst" xmlns:r="http://schemas.openxmlformats.org/officeDocument/2006/relationships" xmlns:m="http://schemas.openxmlformats.org/officeDocument/2006/math" xmlns:v="urn:schemas-microsoft-com:vml" xmlns:wp14="http://schemas.microsoft.com/office/word/2010/wordprocessingDrawing" xmlns:wp="http://schemas.openxmlformats.org/drawingml/2006/wordprocessingDrawing" xmlns:w10="urn:schemas-microsoft-com:office:word" xmlns:w="http://schemas.openxmlformats.org/wordprocessingml/2006/main" xmlns:w14="http://schemas.microsoft.com/office/word/2010/wordml" xmlns:w15="http://schemas.microsoft.com/office/word/2012/wordml" xmlns:w16cex="http://schemas.microsoft.com/office/word/2018/wordml/cex" xmlns:w16cid="http://schemas.microsoft.com/office/word/2016/wordml/cid" xmlns:w16="http://schemas.microsoft.com/office/word/2018/wordml" xmlns:w16du="http://schemas.microsoft.com/office/word/2023/wordml/word16du" xmlns:w16sdtdh="http://schemas.microsoft.com/office/word/2020/wordml/sdtdatahash" xmlns:w16sdtfl="http://schemas.microsoft.com/office/word/2024/wordml/sdtformatlock" xmlns:w16se="http://schemas.microsoft.com/office/word/2015/wordml/symex" xmlns:wpg="http://schemas.microsoft.com/office/word/2010/wordprocessingGroup" xmlns:wpi="http://schemas.microsoft.com/office/word/2010/wordprocessingInk" xmlns:wne="http://schemas.microsoft.com/office/word/2006/wordml" xmlns:wps="http://schemas.microsoft.com/office/word/2010/wordprocessingShape" mc:Ignorable="w14 w15 w16se w16cid w16 w16cex w16sdtdh w16sdtfl w16du wp14">
-  <w16cid:commentId w16cid:paraId="5307BC18" w16cid:durableId="18710610"/>
-</w16cid:commentsIds>
-</file>
-
-<file path=word/people.xml><?xml version="1.0" encoding="utf-8"?>
-<w15:people xmlns:wpc="http://schemas.microsoft.com/office/word/2010/wordprocessingCanvas" xmlns:cx="http://schemas.microsoft.com/office/drawing/2014/chartex" xmlns:cx1="http://schemas.microsoft.com/office/drawing/2015/9/8/chartex" xmlns:cx2="http://schemas.microsoft.com/office/drawing/2015/10/21/chartex" xmlns:cx3="http://schemas.microsoft.com/office/drawing/2016/5/9/chartex" xmlns:cx4="http://schemas.microsoft.com/office/drawing/2016/5/10/chartex" xmlns:cx5="http://schemas.microsoft.com/office/drawing/2016/5/11/chartex" xmlns:cx6="http://schemas.microsoft.com/office/drawing/2016/5/12/chartex" xmlns:cx7="http://schemas.microsoft.com/office/drawing/2016/5/13/chartex" xmlns:cx8="http://schemas.microsoft.com/office/drawing/2016/5/14/chartex" xmlns:mc="http://schemas.openxmlformats.org/markup-compatibility/2006" xmlns:aink="http://schemas.microsoft.com/office/drawing/2016/ink" xmlns:am3d="http://schemas.microsoft.com/office/drawing/2017/model3d" xmlns:o="urn:schemas-microsoft-com:office:office" xmlns:oel="http://schemas.microsoft.com/office/2019/extlst" xmlns:r="http://schemas.openxmlformats.org/officeDocument/2006/relationships" xmlns:m="http://schemas.openxmlformats.org/officeDocument/2006/math" xmlns:v="urn:schemas-microsoft-com:vml" xmlns:wp14="http://schemas.microsoft.com/office/word/2010/wordprocessingDrawing" xmlns:wp="http://schemas.openxmlformats.org/drawingml/2006/wordprocessingDrawing" xmlns:w10="urn:schemas-microsoft-com:office:word" xmlns:w="http://schemas.openxmlformats.org/wordprocessingml/2006/main" xmlns:w14="http://schemas.microsoft.com/office/word/2010/wordml" xmlns:w15="http://schemas.microsoft.com/office/word/2012/wordml" xmlns:w16cex="http://schemas.microsoft.com/office/word/2018/wordml/cex" xmlns:w16cid="http://schemas.microsoft.com/office/word/2016/wordml/cid" xmlns:w16="http://schemas.microsoft.com/office/word/2018/wordml" xmlns:w16du="http://schemas.microsoft.com/office/word/2023/wordml/word16du" xmlns:w16sdtdh="http://schemas.microsoft.com/office/word/2020/wordml/sdtdatahash" xmlns:w16sdtfl="http://schemas.microsoft.com/office/word/2024/wordml/sdtformatlock" xmlns:w16se="http://schemas.microsoft.com/office/word/2015/wordml/symex" xmlns:wpg="http://schemas.microsoft.com/office/word/2010/wordprocessingGroup" xmlns:wpi="http://schemas.microsoft.com/office/word/2010/wordprocessingInk" xmlns:wne="http://schemas.microsoft.com/office/word/2006/wordml" xmlns:wps="http://schemas.microsoft.com/office/word/2010/wordprocessingShape" mc:Ignorable="w14 w15 w16se w16cid w16 w16cex w16sdtdh w16sdtfl w16du wp14">
-  <w15:person w15:author="Sarit Moses">
-    <w15:presenceInfo w15:providerId="AD" w15:userId="S::sarit.moses@weizmann.ac.il::aafe5d20-20a0-4661-a5f7-18c071663775"/>
-  </w15:person>
-</w15:people>
 </file>
 
 <file path=word/styles.xml><?xml version="1.0" encoding="utf-8"?>
@@ -1917,7 +2131,7 @@
     <w:link w:val="figurelegend0"/>
     <w:autoRedefine/>
     <w:qFormat/>
-    <w:rsid w:val="00F6255C"/>
+    <w:rsid w:val="00FD4C50"/>
     <w:pPr>
       <w:ind w:left="851" w:right="851"/>
     </w:pPr>
@@ -1930,7 +2144,7 @@
     <w:name w:val="figure legend תו"/>
     <w:basedOn w:val="a0"/>
     <w:link w:val="figurelegend"/>
-    <w:rsid w:val="00F6255C"/>
+    <w:rsid w:val="00FD4C50"/>
     <w:rPr>
       <w:sz w:val="20"/>
       <w:szCs w:val="20"/>

</xml_diff>